<commit_message>
Corrige la formula del log-retorno (backslash duplicado rompia el renderizado en Word/PDF)
</commit_message>
<xml_diff>
--- a/taller-series-de-tiempo/Taller series de tiempo.docx
+++ b/taller-series-de-tiempo/Taller series de tiempo.docx
@@ -276,8 +276,103 @@
       <w:r>
         <w:t xml:space="preserve"> </w:t>
       </w:r>
-      <w:r>
-        <w:t xml:space="preserve">\( r_t = \log(P_t) - \log(P_{t-1}) \).</w:t>
+      <m:oMath>
+        <m:sSub>
+          <m:e>
+            <m:r>
+              <m:t>r</m:t>
+            </m:r>
+          </m:e>
+          <m:sub>
+            <m:r>
+              <m:t>t</m:t>
+            </m:r>
+          </m:sub>
+        </m:sSub>
+        <m:r>
+          <m:rPr>
+            <m:sty m:val="p"/>
+          </m:rPr>
+          <m:t>=</m:t>
+        </m:r>
+        <m:r>
+          <m:rPr>
+            <m:sty m:val="p"/>
+          </m:rPr>
+          <m:t>log</m:t>
+        </m:r>
+        <m:r>
+          <m:rPr>
+            <m:sty m:val="p"/>
+          </m:rPr>
+          <m:t>(</m:t>
+        </m:r>
+        <m:sSub>
+          <m:e>
+            <m:r>
+              <m:t>P</m:t>
+            </m:r>
+          </m:e>
+          <m:sub>
+            <m:r>
+              <m:t>t</m:t>
+            </m:r>
+          </m:sub>
+        </m:sSub>
+        <m:r>
+          <m:rPr>
+            <m:sty m:val="p"/>
+          </m:rPr>
+          <m:t>)</m:t>
+        </m:r>
+        <m:r>
+          <m:rPr>
+            <m:sty m:val="p"/>
+          </m:rPr>
+          <m:t>−</m:t>
+        </m:r>
+        <m:r>
+          <m:rPr>
+            <m:sty m:val="p"/>
+          </m:rPr>
+          <m:t>log</m:t>
+        </m:r>
+        <m:r>
+          <m:rPr>
+            <m:sty m:val="p"/>
+          </m:rPr>
+          <m:t>(</m:t>
+        </m:r>
+        <m:sSub>
+          <m:e>
+            <m:r>
+              <m:t>P</m:t>
+            </m:r>
+          </m:e>
+          <m:sub>
+            <m:r>
+              <m:t>t</m:t>
+            </m:r>
+            <m:r>
+              <m:rPr>
+                <m:sty m:val="p"/>
+              </m:rPr>
+              <m:t>−</m:t>
+            </m:r>
+            <m:r>
+              <m:t>1</m:t>
+            </m:r>
+          </m:sub>
+        </m:sSub>
+        <m:r>
+          <m:rPr>
+            <m:sty m:val="p"/>
+          </m:rPr>
+          <m:t>)</m:t>
+        </m:r>
+      </m:oMath>
+      <w:r>
+        <w:t xml:space="preserve">.</w:t>
       </w:r>
     </w:p>
     <w:bookmarkEnd w:id="15"/>

</xml_diff>